<commit_message>
Add Groundstructure to the website
</commit_message>
<xml_diff>
--- a/Other-Stuff/Documentation/Ausbildungsprojekt.docx
+++ b/Other-Stuff/Documentation/Ausbildungsprojekt.docx
@@ -32,6 +32,7 @@
           <w:szCs w:val="44"/>
         </w:rPr>
       </w:pPr>
+      <w:proofErr w:type="spellStart"/>
       <w:r>
         <w:rPr>
           <w:b/>
@@ -39,7 +40,17 @@
           <w:sz w:val="44"/>
           <w:szCs w:val="44"/>
         </w:rPr>
-        <w:t>Minigames Website</w:t>
+        <w:t>Minigames</w:t>
+      </w:r>
+      <w:proofErr w:type="spellEnd"/>
+      <w:r>
+        <w:rPr>
+          <w:b/>
+          <w:bCs/>
+          <w:sz w:val="44"/>
+          <w:szCs w:val="44"/>
+        </w:rPr>
+        <w:t xml:space="preserve"> Website</w:t>
       </w:r>
     </w:p>
     <w:p>
@@ -132,33 +143,15 @@
           <w:sz w:val="32"/>
           <w:szCs w:val="32"/>
         </w:rPr>
-        <w:t xml:space="preserve">unktionierende, Relativ Schöne </w:t>
-      </w:r>
-      <w:proofErr w:type="gramStart"/>
-      <w:r>
-        <w:rPr>
-          <w:bCs/>
-          <w:sz w:val="32"/>
-          <w:szCs w:val="32"/>
-        </w:rPr>
-        <w:t>Website</w:t>
-      </w:r>
-      <w:r>
-        <w:rPr>
-          <w:bCs/>
-          <w:sz w:val="32"/>
-          <w:szCs w:val="32"/>
-        </w:rPr>
-        <w:t>(</w:t>
-      </w:r>
-      <w:proofErr w:type="gramEnd"/>
-      <w:r>
-        <w:rPr>
-          <w:bCs/>
-          <w:sz w:val="32"/>
-          <w:szCs w:val="32"/>
-        </w:rPr>
-        <w:t>Also nicht alles einfach schwarz/weiß)</w:t>
+        <w:t>unktionierende, Relativ Schöne Website</w:t>
+      </w:r>
+      <w:r>
+        <w:rPr>
+          <w:bCs/>
+          <w:sz w:val="32"/>
+          <w:szCs w:val="32"/>
+        </w:rPr>
+        <w:t>(Also nicht alles einfach schwarz/weiß)</w:t>
       </w:r>
       <w:r>
         <w:rPr>
@@ -267,8 +260,18 @@
           <w:szCs w:val="32"/>
         </w:rPr>
         <w:tab/>
-        <w:t>Übersicht MInigames</w:t>
-      </w:r>
+        <w:t xml:space="preserve">Übersicht </w:t>
+      </w:r>
+      <w:proofErr w:type="spellStart"/>
+      <w:r>
+        <w:rPr>
+          <w:bCs/>
+          <w:sz w:val="32"/>
+          <w:szCs w:val="32"/>
+        </w:rPr>
+        <w:t>MInigames</w:t>
+      </w:r>
+      <w:proofErr w:type="spellEnd"/>
     </w:p>
     <w:p>
       <w:pPr>
@@ -285,8 +288,18 @@
           <w:sz w:val="32"/>
           <w:szCs w:val="32"/>
         </w:rPr>
-        <w:t>2 Minigames</w:t>
-      </w:r>
+        <w:t xml:space="preserve">2 </w:t>
+      </w:r>
+      <w:proofErr w:type="spellStart"/>
+      <w:r>
+        <w:rPr>
+          <w:bCs/>
+          <w:sz w:val="32"/>
+          <w:szCs w:val="32"/>
+        </w:rPr>
+        <w:t>Minigames</w:t>
+      </w:r>
+      <w:proofErr w:type="spellEnd"/>
       <w:r>
         <w:rPr>
           <w:bCs/>
@@ -312,7 +325,32 @@
           <w:szCs w:val="32"/>
         </w:rPr>
         <w:tab/>
-        <w:t>Spiel 1</w:t>
+      </w:r>
+      <w:r>
+        <w:rPr>
+          <w:bCs/>
+          <w:sz w:val="32"/>
+          <w:szCs w:val="32"/>
+        </w:rPr>
+        <w:t xml:space="preserve">Game </w:t>
+      </w:r>
+      <w:proofErr w:type="spellStart"/>
+      <w:r>
+        <w:rPr>
+          <w:bCs/>
+          <w:sz w:val="32"/>
+          <w:szCs w:val="32"/>
+        </w:rPr>
+        <w:t>Of</w:t>
+      </w:r>
+      <w:proofErr w:type="spellEnd"/>
+      <w:r>
+        <w:rPr>
+          <w:bCs/>
+          <w:sz w:val="32"/>
+          <w:szCs w:val="32"/>
+        </w:rPr>
+        <w:t xml:space="preserve"> Life (Simulation)</w:t>
       </w:r>
     </w:p>
     <w:p>
@@ -331,7 +369,32 @@
           <w:szCs w:val="32"/>
         </w:rPr>
         <w:tab/>
-        <w:t>Spiel 2</w:t>
+      </w:r>
+      <w:r>
+        <w:rPr>
+          <w:bCs/>
+          <w:sz w:val="32"/>
+          <w:szCs w:val="32"/>
+        </w:rPr>
+        <w:t xml:space="preserve">Emoji </w:t>
+      </w:r>
+      <w:proofErr w:type="spellStart"/>
+      <w:r>
+        <w:rPr>
+          <w:bCs/>
+          <w:sz w:val="32"/>
+          <w:szCs w:val="32"/>
+        </w:rPr>
+        <w:t>Dodger</w:t>
+      </w:r>
+      <w:proofErr w:type="spellEnd"/>
+      <w:r>
+        <w:rPr>
+          <w:bCs/>
+          <w:sz w:val="32"/>
+          <w:szCs w:val="32"/>
+        </w:rPr>
+        <w:t>[S2] (Action)</w:t>
       </w:r>
     </w:p>
     <w:p>
@@ -404,6 +467,7 @@
           <w:szCs w:val="32"/>
         </w:rPr>
       </w:pPr>
+      <w:proofErr w:type="spellStart"/>
       <w:r>
         <w:rPr>
           <w:bCs/>
@@ -412,15 +476,17 @@
         </w:rPr>
         <w:t>Xampp</w:t>
       </w:r>
-    </w:p>
-    <w:p>
-      <w:pPr>
-        <w:rPr>
-          <w:bCs/>
-          <w:sz w:val="32"/>
-          <w:szCs w:val="32"/>
-        </w:rPr>
-      </w:pPr>
+      <w:proofErr w:type="spellEnd"/>
+    </w:p>
+    <w:p>
+      <w:pPr>
+        <w:rPr>
+          <w:bCs/>
+          <w:sz w:val="32"/>
+          <w:szCs w:val="32"/>
+        </w:rPr>
+      </w:pPr>
+      <w:proofErr w:type="spellStart"/>
       <w:r>
         <w:rPr>
           <w:bCs/>
@@ -429,159 +495,103 @@
         </w:rPr>
         <w:t>WebStorm</w:t>
       </w:r>
-    </w:p>
-    <w:p>
-      <w:pPr>
-        <w:rPr>
-          <w:bCs/>
-          <w:sz w:val="32"/>
-          <w:szCs w:val="32"/>
-        </w:rPr>
-      </w:pPr>
-      <w:r>
-        <w:rPr>
-          <w:bCs/>
-          <w:sz w:val="32"/>
-          <w:szCs w:val="32"/>
-        </w:rPr>
-        <w:t>Html, CSS, JavaScript</w:t>
-      </w:r>
-    </w:p>
-    <w:p>
-      <w:pPr>
-        <w:rPr>
-          <w:bCs/>
-          <w:sz w:val="32"/>
-          <w:szCs w:val="32"/>
-        </w:rPr>
-      </w:pPr>
-    </w:p>
-    <w:p>
-      <w:pPr>
-        <w:rPr>
-          <w:bCs/>
-          <w:sz w:val="32"/>
-          <w:szCs w:val="32"/>
-        </w:rPr>
-      </w:pPr>
-    </w:p>
-    <w:p>
-      <w:pPr>
-        <w:rPr>
-          <w:bCs/>
-          <w:sz w:val="32"/>
-          <w:szCs w:val="32"/>
-        </w:rPr>
-      </w:pPr>
-    </w:p>
-    <w:p>
-      <w:pPr>
-        <w:rPr>
-          <w:bCs/>
-          <w:sz w:val="32"/>
-          <w:szCs w:val="32"/>
-        </w:rPr>
-      </w:pPr>
-    </w:p>
-    <w:p>
-      <w:pPr>
-        <w:rPr>
-          <w:bCs/>
-          <w:sz w:val="32"/>
-          <w:szCs w:val="32"/>
-        </w:rPr>
-      </w:pPr>
-    </w:p>
-    <w:p>
-      <w:pPr>
-        <w:rPr>
-          <w:bCs/>
-          <w:sz w:val="32"/>
-          <w:szCs w:val="32"/>
-        </w:rPr>
-      </w:pPr>
-    </w:p>
-    <w:p>
-      <w:pPr>
-        <w:rPr>
-          <w:bCs/>
-          <w:sz w:val="32"/>
-          <w:szCs w:val="32"/>
-        </w:rPr>
-      </w:pPr>
-    </w:p>
-    <w:p>
-      <w:pPr>
-        <w:rPr>
-          <w:bCs/>
-          <w:sz w:val="32"/>
-          <w:szCs w:val="32"/>
-        </w:rPr>
-      </w:pPr>
-    </w:p>
-    <w:p>
-      <w:pPr>
-        <w:rPr>
-          <w:bCs/>
-          <w:sz w:val="32"/>
-          <w:szCs w:val="32"/>
-        </w:rPr>
-      </w:pPr>
-    </w:p>
-    <w:p>
-      <w:pPr>
-        <w:rPr>
-          <w:bCs/>
-          <w:sz w:val="32"/>
-          <w:szCs w:val="32"/>
-        </w:rPr>
-      </w:pPr>
-    </w:p>
-    <w:p>
-      <w:pPr>
-        <w:spacing w:line="240" w:lineRule="auto"/>
+      <w:proofErr w:type="spellEnd"/>
+    </w:p>
+    <w:p>
+      <w:pPr>
+        <w:rPr>
+          <w:bCs/>
+          <w:sz w:val="32"/>
+          <w:szCs w:val="32"/>
+        </w:rPr>
+      </w:pPr>
+      <w:proofErr w:type="spellStart"/>
+      <w:r>
+        <w:rPr>
+          <w:bCs/>
+          <w:sz w:val="32"/>
+          <w:szCs w:val="32"/>
+        </w:rPr>
+        <w:t>Html</w:t>
+      </w:r>
+      <w:proofErr w:type="spellEnd"/>
+      <w:r>
+        <w:rPr>
+          <w:bCs/>
+          <w:sz w:val="32"/>
+          <w:szCs w:val="32"/>
+        </w:rPr>
+        <w:t>, CSS, JavaScript</w:t>
+      </w:r>
+    </w:p>
+    <w:p>
+      <w:pPr>
+        <w:rPr>
+          <w:bCs/>
+          <w:sz w:val="32"/>
+          <w:szCs w:val="32"/>
+        </w:rPr>
+      </w:pPr>
+    </w:p>
+    <w:p>
+      <w:pPr>
+        <w:rPr>
+          <w:bCs/>
+          <w:sz w:val="32"/>
+          <w:szCs w:val="32"/>
+        </w:rPr>
+      </w:pPr>
+      <w:r>
+        <w:rPr>
+          <w:bCs/>
+          <w:sz w:val="32"/>
+          <w:szCs w:val="32"/>
+        </w:rPr>
+        <w:lastRenderedPageBreak/>
+        <w:br/>
+      </w:r>
+      <w:r>
+        <w:rPr>
+          <w:rFonts w:ascii="Times New Roman" w:eastAsia="Times New Roman" w:hAnsi="Symbol" w:cs="Times New Roman"/>
+          <w:sz w:val="24"/>
+          <w:szCs w:val="24"/>
+          <w:lang w:eastAsia="de-DE"/>
+        </w:rPr>
+        <w:t></w:t>
+      </w:r>
+      <w:r>
         <w:rPr>
           <w:rFonts w:ascii="Times New Roman" w:eastAsia="Times New Roman" w:hAnsi="Times New Roman" w:cs="Times New Roman"/>
           <w:sz w:val="24"/>
           <w:szCs w:val="24"/>
           <w:lang w:eastAsia="de-DE"/>
         </w:rPr>
-      </w:pPr>
-      <w:r>
-        <w:rPr>
-          <w:bCs/>
-          <w:sz w:val="32"/>
-          <w:szCs w:val="32"/>
-        </w:rPr>
-        <w:t>Spiel ideen: (Ai generiert)</w:t>
-      </w:r>
-      <w:r>
-        <w:rPr>
-          <w:bCs/>
-          <w:sz w:val="32"/>
-          <w:szCs w:val="32"/>
-        </w:rPr>
-        <w:br/>
-      </w:r>
-      <w:proofErr w:type="gramStart"/>
-      <w:r>
-        <w:rPr>
-          <w:rFonts w:ascii="Times New Roman" w:eastAsia="Times New Roman" w:hAnsi="Symbol" w:cs="Times New Roman"/>
+        <w:t xml:space="preserve">  </w:t>
+      </w:r>
+      <w:r>
+        <w:rPr>
+          <w:rFonts w:ascii="Arial" w:eastAsia="Times New Roman" w:hAnsi="Arial" w:cs="Arial"/>
+          <w:b/>
+          <w:bCs/>
           <w:sz w:val="24"/>
           <w:szCs w:val="24"/>
           <w:lang w:eastAsia="de-DE"/>
         </w:rPr>
-        <w:t></w:t>
-      </w:r>
-      <w:r>
-        <w:rPr>
-          <w:rFonts w:ascii="Times New Roman" w:eastAsia="Times New Roman" w:hAnsi="Times New Roman" w:cs="Times New Roman"/>
+        <w:t>Emoji-</w:t>
+      </w:r>
+      <w:proofErr w:type="spellStart"/>
+      <w:r>
+        <w:rPr>
+          <w:rFonts w:ascii="Arial" w:eastAsia="Times New Roman" w:hAnsi="Arial" w:cs="Arial"/>
+          <w:b/>
+          <w:bCs/>
           <w:sz w:val="24"/>
           <w:szCs w:val="24"/>
           <w:lang w:eastAsia="de-DE"/>
         </w:rPr>
-        <w:t xml:space="preserve">  </w:t>
-      </w:r>
+        <w:t>Dodger</w:t>
+      </w:r>
+      <w:proofErr w:type="spellEnd"/>
       <w:r>
         <w:rPr>
           <w:rFonts w:ascii="Arial" w:eastAsia="Times New Roman" w:hAnsi="Arial" w:cs="Arial"/>
@@ -591,19 +601,7 @@
           <w:szCs w:val="24"/>
           <w:lang w:eastAsia="de-DE"/>
         </w:rPr>
-        <w:t>Emoji</w:t>
-      </w:r>
-      <w:proofErr w:type="gramEnd"/>
-      <w:r>
-        <w:rPr>
-          <w:rFonts w:ascii="Arial" w:eastAsia="Times New Roman" w:hAnsi="Arial" w:cs="Arial"/>
-          <w:b/>
-          <w:bCs/>
-          <w:sz w:val="24"/>
-          <w:szCs w:val="24"/>
-          <w:lang w:eastAsia="de-DE"/>
-        </w:rPr>
-        <w:t>-Dodger:</w:t>
+        <w:t>:</w:t>
       </w:r>
       <w:r>
         <w:rPr>
@@ -613,272 +611,6 @@
           <w:lang w:eastAsia="de-DE"/>
         </w:rPr>
         <w:t xml:space="preserve"> Der Spieler steuert eine Figur (z. B. mit Pfeiltasten) am unteren Bildschirmrand und weicht Objekten aus, die von oben herabfallen (z. B. fallende Emojis oder Blitze). Der Punktestand steigt mit jeder Sekunde des Überlebens.</w:t>
-      </w:r>
-    </w:p>
-    <w:p>
-      <w:pPr>
-        <w:spacing w:after="0" w:line="240" w:lineRule="auto"/>
-        <w:rPr>
-          <w:rFonts w:ascii="Times New Roman" w:eastAsia="Times New Roman" w:hAnsi="Times New Roman" w:cs="Times New Roman"/>
-          <w:sz w:val="24"/>
-          <w:szCs w:val="24"/>
-          <w:lang w:eastAsia="de-DE"/>
-        </w:rPr>
-      </w:pPr>
-      <w:proofErr w:type="gramStart"/>
-      <w:r>
-        <w:rPr>
-          <w:rFonts w:ascii="Times New Roman" w:eastAsia="Times New Roman" w:hAnsi="Symbol" w:cs="Times New Roman"/>
-          <w:sz w:val="24"/>
-          <w:szCs w:val="24"/>
-          <w:lang w:eastAsia="de-DE"/>
-        </w:rPr>
-        <w:t></w:t>
-      </w:r>
-      <w:r>
-        <w:rPr>
-          <w:rFonts w:ascii="Times New Roman" w:eastAsia="Times New Roman" w:hAnsi="Times New Roman" w:cs="Times New Roman"/>
-          <w:sz w:val="24"/>
-          <w:szCs w:val="24"/>
-          <w:lang w:eastAsia="de-DE"/>
-        </w:rPr>
-        <w:t xml:space="preserve">  </w:t>
-      </w:r>
-      <w:r>
-        <w:rPr>
-          <w:rFonts w:ascii="Arial" w:eastAsia="Times New Roman" w:hAnsi="Arial" w:cs="Arial"/>
-          <w:b/>
-          <w:bCs/>
-          <w:sz w:val="24"/>
-          <w:szCs w:val="24"/>
-          <w:lang w:eastAsia="de-DE"/>
-        </w:rPr>
-        <w:t>Wort</w:t>
-      </w:r>
-      <w:proofErr w:type="gramEnd"/>
-      <w:r>
-        <w:rPr>
-          <w:rFonts w:ascii="Arial" w:eastAsia="Times New Roman" w:hAnsi="Arial" w:cs="Arial"/>
-          <w:b/>
-          <w:bCs/>
-          <w:sz w:val="24"/>
-          <w:szCs w:val="24"/>
-          <w:lang w:eastAsia="de-DE"/>
-        </w:rPr>
-        <w:t>- oder Zahlen-Ratespiel (Mastermind):</w:t>
-      </w:r>
-      <w:r>
-        <w:rPr>
-          <w:rFonts w:ascii="Arial" w:eastAsia="Times New Roman" w:hAnsi="Arial" w:cs="Arial"/>
-          <w:sz w:val="24"/>
-          <w:szCs w:val="24"/>
-          <w:lang w:eastAsia="de-DE"/>
-        </w:rPr>
-        <w:t xml:space="preserve"> Der Computer wählt eine geheime Kombination, und der Nutzer hat begrenzte Versuche, diese zu erraten. Nach jedem Versuch erhält man Feedback darüber, wie viele Zahlen/Buchstaben an der richtigen Position sind.</w:t>
-      </w:r>
-    </w:p>
-    <w:p>
-      <w:pPr>
-        <w:spacing w:after="0" w:line="240" w:lineRule="auto"/>
-        <w:rPr>
-          <w:rFonts w:ascii="Times New Roman" w:eastAsia="Times New Roman" w:hAnsi="Times New Roman" w:cs="Times New Roman"/>
-          <w:sz w:val="24"/>
-          <w:szCs w:val="24"/>
-          <w:lang w:eastAsia="de-DE"/>
-        </w:rPr>
-      </w:pPr>
-      <w:proofErr w:type="gramStart"/>
-      <w:r>
-        <w:rPr>
-          <w:rFonts w:ascii="Times New Roman" w:eastAsia="Times New Roman" w:hAnsi="Symbol" w:cs="Times New Roman"/>
-          <w:sz w:val="24"/>
-          <w:szCs w:val="24"/>
-          <w:lang w:eastAsia="de-DE"/>
-        </w:rPr>
-        <w:t></w:t>
-      </w:r>
-      <w:r>
-        <w:rPr>
-          <w:rFonts w:ascii="Times New Roman" w:eastAsia="Times New Roman" w:hAnsi="Times New Roman" w:cs="Times New Roman"/>
-          <w:sz w:val="24"/>
-          <w:szCs w:val="24"/>
-          <w:lang w:eastAsia="de-DE"/>
-        </w:rPr>
-        <w:t xml:space="preserve">  </w:t>
-      </w:r>
-      <w:r>
-        <w:rPr>
-          <w:rFonts w:ascii="Arial" w:eastAsia="Times New Roman" w:hAnsi="Arial" w:cs="Arial"/>
-          <w:b/>
-          <w:bCs/>
-          <w:sz w:val="24"/>
-          <w:szCs w:val="24"/>
-          <w:lang w:eastAsia="de-DE"/>
-        </w:rPr>
-        <w:t>Reaktionsspiel</w:t>
-      </w:r>
-      <w:proofErr w:type="gramEnd"/>
-      <w:r>
-        <w:rPr>
-          <w:rFonts w:ascii="Arial" w:eastAsia="Times New Roman" w:hAnsi="Arial" w:cs="Arial"/>
-          <w:b/>
-          <w:bCs/>
-          <w:sz w:val="24"/>
-          <w:szCs w:val="24"/>
-          <w:lang w:eastAsia="de-DE"/>
-        </w:rPr>
-        <w:t xml:space="preserve"> (Clicker):</w:t>
-      </w:r>
-      <w:r>
-        <w:rPr>
-          <w:rFonts w:ascii="Arial" w:eastAsia="Times New Roman" w:hAnsi="Arial" w:cs="Arial"/>
-          <w:sz w:val="24"/>
-          <w:szCs w:val="24"/>
-          <w:lang w:eastAsia="de-DE"/>
-        </w:rPr>
-        <w:t xml:space="preserve"> Ein Element (z. B. ein roter Kreis) erscheint zufällig auf dem Bildschirm. Der Spieler muss so schnell wie möglich </w:t>
-      </w:r>
-      <w:proofErr w:type="gramStart"/>
-      <w:r>
-        <w:rPr>
-          <w:rFonts w:ascii="Arial" w:eastAsia="Times New Roman" w:hAnsi="Arial" w:cs="Arial"/>
-          <w:sz w:val="24"/>
-          <w:szCs w:val="24"/>
-          <w:lang w:eastAsia="de-DE"/>
-        </w:rPr>
-        <w:t>darauf klicken</w:t>
-      </w:r>
-      <w:proofErr w:type="gramEnd"/>
-      <w:r>
-        <w:rPr>
-          <w:rFonts w:ascii="Arial" w:eastAsia="Times New Roman" w:hAnsi="Arial" w:cs="Arial"/>
-          <w:sz w:val="24"/>
-          <w:szCs w:val="24"/>
-          <w:lang w:eastAsia="de-DE"/>
-        </w:rPr>
-        <w:t>. Die Zeitspanne zwischen den Klicks wird gemessen und der eigene Highscore festgehalten.</w:t>
-      </w:r>
-    </w:p>
-    <w:p>
-      <w:pPr>
-        <w:spacing w:after="0" w:line="240" w:lineRule="auto"/>
-        <w:rPr>
-          <w:rFonts w:ascii="Times New Roman" w:eastAsia="Times New Roman" w:hAnsi="Times New Roman" w:cs="Times New Roman"/>
-          <w:sz w:val="24"/>
-          <w:szCs w:val="24"/>
-          <w:lang w:eastAsia="de-DE"/>
-        </w:rPr>
-      </w:pPr>
-      <w:proofErr w:type="gramStart"/>
-      <w:r>
-        <w:rPr>
-          <w:rFonts w:ascii="Times New Roman" w:eastAsia="Times New Roman" w:hAnsi="Symbol" w:cs="Times New Roman"/>
-          <w:sz w:val="24"/>
-          <w:szCs w:val="24"/>
-          <w:lang w:eastAsia="de-DE"/>
-        </w:rPr>
-        <w:t></w:t>
-      </w:r>
-      <w:r>
-        <w:rPr>
-          <w:rFonts w:ascii="Times New Roman" w:eastAsia="Times New Roman" w:hAnsi="Times New Roman" w:cs="Times New Roman"/>
-          <w:sz w:val="24"/>
-          <w:szCs w:val="24"/>
-          <w:lang w:eastAsia="de-DE"/>
-        </w:rPr>
-        <w:t xml:space="preserve">  </w:t>
-      </w:r>
-      <w:r>
-        <w:rPr>
-          <w:rFonts w:ascii="Arial" w:eastAsia="Times New Roman" w:hAnsi="Arial" w:cs="Arial"/>
-          <w:b/>
-          <w:bCs/>
-          <w:sz w:val="24"/>
-          <w:szCs w:val="24"/>
-          <w:lang w:eastAsia="de-DE"/>
-        </w:rPr>
-        <w:t>Simon</w:t>
-      </w:r>
-      <w:proofErr w:type="gramEnd"/>
-      <w:r>
-        <w:rPr>
-          <w:rFonts w:ascii="Arial" w:eastAsia="Times New Roman" w:hAnsi="Arial" w:cs="Arial"/>
-          <w:b/>
-          <w:bCs/>
-          <w:sz w:val="24"/>
-          <w:szCs w:val="24"/>
-          <w:lang w:eastAsia="de-DE"/>
-        </w:rPr>
-        <w:t xml:space="preserve"> Says (Memory):</w:t>
-      </w:r>
-      <w:r>
-        <w:rPr>
-          <w:rFonts w:ascii="Arial" w:eastAsia="Times New Roman" w:hAnsi="Arial" w:cs="Arial"/>
-          <w:sz w:val="24"/>
-          <w:szCs w:val="24"/>
-          <w:lang w:eastAsia="de-DE"/>
-        </w:rPr>
-        <w:t xml:space="preserve"> Ein Feld mit vier farbigen Buttons, die in einer bestimmten Reihenfolge aufleuchten. Der Spieler muss die Sequenz exakt wiederholen, wobei die Reihenfolge mit jeder Runde länger wird.</w:t>
-      </w:r>
-    </w:p>
-    <w:p>
-      <w:pPr>
-        <w:rPr>
-          <w:bCs/>
-          <w:sz w:val="32"/>
-          <w:szCs w:val="32"/>
-        </w:rPr>
-      </w:pPr>
-      <w:proofErr w:type="gramStart"/>
-      <w:r>
-        <w:rPr>
-          <w:rFonts w:ascii="Times New Roman" w:eastAsia="Times New Roman" w:hAnsi="Symbol" w:cs="Times New Roman"/>
-          <w:sz w:val="24"/>
-          <w:szCs w:val="24"/>
-          <w:lang w:eastAsia="de-DE"/>
-        </w:rPr>
-        <w:t></w:t>
-      </w:r>
-      <w:r>
-        <w:rPr>
-          <w:rFonts w:ascii="Times New Roman" w:eastAsia="Times New Roman" w:hAnsi="Times New Roman" w:cs="Times New Roman"/>
-          <w:sz w:val="24"/>
-          <w:szCs w:val="24"/>
-          <w:lang w:eastAsia="de-DE"/>
-        </w:rPr>
-        <w:t xml:space="preserve">  </w:t>
-      </w:r>
-      <w:r>
-        <w:rPr>
-          <w:rFonts w:ascii="Arial" w:eastAsia="Times New Roman" w:hAnsi="Arial" w:cs="Arial"/>
-          <w:b/>
-          <w:bCs/>
-          <w:sz w:val="24"/>
-          <w:szCs w:val="24"/>
-          <w:lang w:eastAsia="de-DE"/>
-        </w:rPr>
-        <w:t>Snake</w:t>
-      </w:r>
-      <w:proofErr w:type="gramEnd"/>
-      <w:r>
-        <w:rPr>
-          <w:rFonts w:ascii="Arial" w:eastAsia="Times New Roman" w:hAnsi="Arial" w:cs="Arial"/>
-          <w:b/>
-          <w:bCs/>
-          <w:sz w:val="24"/>
-          <w:szCs w:val="24"/>
-          <w:lang w:eastAsia="de-DE"/>
-        </w:rPr>
-        <w:t>-Klon:</w:t>
-      </w:r>
-      <w:r>
-        <w:rPr>
-          <w:rFonts w:ascii="Arial" w:eastAsia="Times New Roman" w:hAnsi="Arial" w:cs="Arial"/>
-          <w:sz w:val="24"/>
-          <w:szCs w:val="24"/>
-          <w:lang w:eastAsia="de-DE"/>
-        </w:rPr>
-        <w:t xml:space="preserve"> Der absolute Klassiker! Eine kleine Schlange frisst Objekte (z. B. Äpfel), wird dadurch länger und darf weder den eigenen Körper noch die Bildschirmränder berühren.</w:t>
       </w:r>
     </w:p>
     <w:p>

</xml_diff>